<commit_message>
Replace placeholder logo with real MMG Master Logo (gradient landscape)
Embedded from official brand asset files (Adobe Illustrator vector
source, positive/gradient/landscape lockup) per brand guidelines:
Master Logo on white background, gradient symbol + black wordmark.

Co-Authored-By: Claude Fable 5 <noreply@anthropic.com>
Claude-Session: https://claude.ai/code/session_019EoJuzBaRKmij9AN1LjC6F
</commit_message>
<xml_diff>
--- a/docs/mmg/sales-compensation/MMG - Sales Commission Agreement - Jeff Gibbs - v1.docx
+++ b/docs/mmg/sales-compensation/MMG - Sales Commission Agreement - Jeff Gibbs - v1.docx
@@ -22,7 +22,7 @@
       <w:r>
         <w:drawing>
           <wp:inline distT="0" distB="0" distL="0" distR="0">
-            <wp:extent cx="2286000" cy="571500"/>
+            <wp:extent cx="2247900" cy="628650"/>
             <wp:effectExtent t="0" r="0" b="0" l="0"/>
             <wp:docPr id="1" name="" descr="" title=""/>
             <wp:cNvGraphicFramePr>
@@ -47,7 +47,7 @@
                   <pic:spPr bwMode="auto">
                     <a:xfrm>
                       <a:off x="0" y="0"/>
-                      <a:ext cx="2286000" cy="571500"/>
+                      <a:ext cx="2247900" cy="628650"/>
                     </a:xfrm>
                     <a:prstGeom prst="rect">
                       <a:avLst/>

</xml_diff>